<commit_message>
Final send-ready email: numbered attachment list, LOC sizing disclosure
Co-Authored-By: Claude Fable 5 <noreply@anthropic.com>
Claude-Session: https://claude.ai/code/session_01GAHLyfqLR9bxwN2jm6VjPU
</commit_message>
<xml_diff>
--- a/sba_application/13_checklist_response_2026-07-16/8 Reply Email John Mary DRAFT.docx
+++ b/sba_application/13_checklist_response_2026-07-16/8 Reply Email John Mary DRAFT.docx
@@ -74,7 +74,7 @@
         <w:rPr>
           <w:sz w:val="22"/>
         </w:rPr>
-        <w:t>Loan ask simplified to ONE SBA 7(a) loan of $500,000. The piggyback bank loan is gone. The seller carries $375K at 6% ($31,250 a month from September), and the SBA loan funds in January at the 51% transfer, paying the ~$258K balloon plus ramp working capital. January is the base case on purpose: funding at the 100% transfer avoids the seller guaranty rules that come with lending into a partial change of ownership. If one of your lenders can fund September anyway, the note is prepayable without penalty and we save four installments.</w:t>
+        <w:t>Loan ask simplified to ONE SBA 7(a) loan of $500,000. The piggyback bank loan is gone. The seller carries $375K at 6% ($31,250 a month from September), and the SBA loan funds in January at the 51% transfer, paying the ~$258K balloon plus ramp working capital. January is the base case on purpose: funding at the 100% transfer avoids the seller guaranty rules that come with lending into a partial change of ownership. If one of your lenders can fund September anyway, the note is prepayable without penalty and we save four installments. On the interim line: base case peak need is about $183K, and the slow census downside needs up to $375K of availability, so I want to size the LOC conversation accordingly rather than have it surface in underwriting.</w:t>
       </w:r>
     </w:p>
     <w:p>
@@ -85,7 +85,7 @@
         <w:rPr>
           <w:sz w:val="22"/>
         </w:rPr>
-        <w:t>Working capital reserve cut from $672K to $235K. John, this is your 6/3 note answered: the license bills immediately and the seller carries the acquisition until takeout, so the reserve is a bridge, not a parking lot. The attached workbook breaks the $235K into components with a month by month draw schedule, and I'm fine with the bank controlling disbursements against census milestones. Until the loan funds in January we bridge on equity plus a small line; peak interim need in the base case is about $183K.</w:t>
+        <w:t>Working capital reserve cut from $672K to $235K. John, this is your 6/3 note answered: the license bills immediately and the seller carries the acquisition until takeout, so the reserve is a bridge, not a parking lot. The attached workbook breaks the $235K into components with a month by month draw schedule, and I'm fine with the bank controlling disbursements against census milestones. Until the loan funds in January we bridge on equity plus the interim line.</w:t>
       </w:r>
     </w:p>
     <w:p>
@@ -116,7 +116,7 @@
           <w:b/>
           <w:sz w:val="22"/>
         </w:rPr>
-        <w:t>WHAT'S ATTACHED:</w:t>
+        <w:t>WHAT'S ATTACHED (11 files):</w:t>
       </w:r>
     </w:p>
     <w:p>
@@ -127,7 +127,7 @@
         <w:rPr>
           <w:sz w:val="22"/>
         </w:rPr>
-        <w:t>Use of proceeds workbook in your format: loan structure, the $235K working capital detail with draw timeline, and the seller note takeout schedule.</w:t>
+        <w:t>1. UOP Azalea Refuge Rev1.00.xlsx - your structure sheet redone: loan structure, the $235K working capital components with the month by month draw schedule, and the seller note timeline.</w:t>
       </w:r>
     </w:p>
     <w:p>
@@ -138,7 +138,7 @@
         <w:rPr>
           <w:sz w:val="22"/>
         </w:rPr>
-        <w:t>Your checklist forms, filled: Company Profile, Use of Proceeds, and Business Debt Schedule (seller note on it, per Mary's note).</w:t>
+        <w:t>2. 2 Company Profile FILLED.pdf - your form, filled.</w:t>
       </w:r>
     </w:p>
     <w:p>
@@ -149,7 +149,7 @@
         <w:rPr>
           <w:sz w:val="22"/>
         </w:rPr>
-        <w:t>Item by item checklist status so you can see exactly what's in hand and what's still coming.</w:t>
+        <w:t>3. 3 Use of Proceeds FILLED.pdf - your form, filled.</w:t>
       </w:r>
     </w:p>
     <w:p>
@@ -160,7 +160,7 @@
         <w:rPr>
           <w:sz w:val="22"/>
         </w:rPr>
-        <w:t>Financial projections, monthly for 36 months with written assumptions, officer salaries split out.</w:t>
+        <w:t>4. 5 Business Debt Schedule FILLED.pdf - seller note on it, per Mary's note.</w:t>
       </w:r>
     </w:p>
     <w:p>
@@ -171,7 +171,7 @@
         <w:rPr>
           <w:sz w:val="22"/>
         </w:rPr>
-        <w:t>Business plan addendum covering the target change (full updated plan to follow this week).</w:t>
+        <w:t>5. 1 Checklist STATUS RESPONSE.docx - item by item status on your whole checklist, plus answers to the ten COVID questions.</w:t>
       </w:r>
     </w:p>
     <w:p>
@@ -182,7 +182,71 @@
         <w:rPr>
           <w:sz w:val="22"/>
         </w:rPr>
-        <w:t>The executed lease and the purchase agreement.</w:t>
+        <w:t>6. 7 Financial Projections Rev3.10.xlsx - monthly for 36 months, officer salaries split out.</w:t>
+      </w:r>
+    </w:p>
+    <w:p>
+      <w:pPr>
+        <w:pStyle w:val="ListBullet"/>
+      </w:pPr>
+      <w:r>
+        <w:rPr>
+          <w:sz w:val="22"/>
+        </w:rPr>
+        <w:t>7. 6 Projection Assumptions Narrative.docx - the written assumptions behind the numbers.</w:t>
+      </w:r>
+    </w:p>
+    <w:p>
+      <w:pPr>
+        <w:pStyle w:val="ListBullet"/>
+      </w:pPr>
+      <w:r>
+        <w:rPr>
+          <w:sz w:val="22"/>
+        </w:rPr>
+        <w:t>8. Azalea SBA Business Plan Rev6.00.docx - the full updated plan in editable Word, rewritten for Refuge.</w:t>
+      </w:r>
+    </w:p>
+    <w:p>
+      <w:pPr>
+        <w:pStyle w:val="ListBullet"/>
+      </w:pPr>
+      <w:r>
+        <w:rPr>
+          <w:sz w:val="22"/>
+        </w:rPr>
+        <w:t>9. 4 Business Plan ADDENDUM Refuge.docx - one page summary of the target change for quick reads.</w:t>
+      </w:r>
+    </w:p>
+    <w:p>
+      <w:pPr>
+        <w:pStyle w:val="ListBullet"/>
+      </w:pPr>
+      <w:r>
+        <w:rPr>
+          <w:sz w:val="22"/>
+        </w:rPr>
+        <w:t>10. 10 Executed Lease Gary House 6.29.26.pdf - fully executed office lease.</w:t>
+      </w:r>
+    </w:p>
+    <w:p>
+      <w:pPr>
+        <w:pStyle w:val="ListBullet"/>
+      </w:pPr>
+      <w:r>
+        <w:rPr>
+          <w:sz w:val="22"/>
+        </w:rPr>
+        <w:t>11. The signed Refuge purchase agreement (MIPA).</w:t>
+      </w:r>
+    </w:p>
+    <w:p>
+      <w:r>
+        <w:rPr>
+          <w:b w:val="0"/>
+          <w:sz w:val="22"/>
+        </w:rPr>
+        <w:t>Coming separately through your secure upload: my 2022, 2023 and 2024 personal returns, then the personal financial statement, personal history form, cash flow statement, credit report and driver license as I finish them this week.</w:t>
       </w:r>
     </w:p>
     <w:p>

</xml_diff>